<commit_message>
docs: enlazar el repositorio real en el informe
</commit_message>
<xml_diff>
--- a/SI886-LAB-02_vargas.docx
+++ b/SI886-LAB-02_vargas.docx
@@ -879,9 +879,9 @@
       <w:r>
         <w:rPr>
           <w:b w:val="0"/>
-          <w:i/>
+          <w:i w:val="0"/>
         </w:rPr>
-        <w:t>URL DEL GITHUB: [completar con el enlace del repositorio de papeles de trabajo del estudiante]</w:t>
+        <w:t>URL DEL GITHUB: https://github.com/AngelVargasGutierrez/peti-si886</w:t>
       </w:r>
     </w:p>
     <w:p>

</xml_diff>

<commit_message>
fix: separar scripts VS02/VS03 por fuente, corregir filtro del grafico y actualizar cifras del Banco Mundial a 2024
</commit_message>
<xml_diff>
--- a/SI886-LAB-02_vargas.docx
+++ b/SI886-LAB-02_vargas.docx
@@ -2409,7 +2409,7 @@
           <w:b w:val="0"/>
           <w:i w:val="0"/>
         </w:rPr>
-        <w:t>Suscripciones a telefonía móvil por cada 100 personas (2023):</w:t>
+        <w:t>Suscripciones a telefonía móvil por cada 100 personas (2024):</w:t>
       </w:r>
     </w:p>
     <w:tbl>
@@ -2484,7 +2484,7 @@
               <w:rPr>
                 <w:sz w:val="19"/>
               </w:rPr>
-              <w:t>166.98</w:t>
+              <w:t>174.09</w:t>
             </w:r>
           </w:p>
         </w:tc>
@@ -2514,7 +2514,7 @@
               <w:rPr>
                 <w:sz w:val="19"/>
               </w:rPr>
-              <w:t>135.87</w:t>
+              <w:t>132.66</w:t>
             </w:r>
           </w:p>
         </w:tc>
@@ -2544,7 +2544,7 @@
               <w:rPr>
                 <w:sz w:val="19"/>
               </w:rPr>
-              <w:t>121.98</w:t>
+              <w:t>124.62</w:t>
             </w:r>
           </w:p>
         </w:tc>
@@ -2574,7 +2574,7 @@
               <w:rPr>
                 <w:sz w:val="19"/>
               </w:rPr>
-              <w:t>111.74</w:t>
+              <w:t>116.49</w:t>
             </w:r>
           </w:p>
         </w:tc>
@@ -2604,7 +2604,7 @@
               <w:rPr>
                 <w:sz w:val="19"/>
               </w:rPr>
-              <w:t>101.02</w:t>
+              <w:t>101.93</w:t>
             </w:r>
           </w:p>
         </w:tc>
@@ -5330,7 +5330,7 @@
           <w:b w:val="0"/>
           <w:i w:val="0"/>
         </w:rPr>
-        <w:t>La comparación regional sitúa la posición real de la organización y de su mercado: el 81.96% de usuarios de Internet en el Perú lo ubica por debajo de Chile, Brasil y México, y el 121.98% de líneas móviles por cada 100 habitantes lo ubica por debajo de Colombia y Chile; esto evita el error de asumir que la adopción digital observada en mercados más maduros se replicará con la misma intensidad en el despliegue local de canales digitales.</w:t>
+        <w:t>La comparación regional sitúa la posición real de la organización y de su mercado: el 81.96% de usuarios de Internet en el Perú lo ubica por debajo de Chile, Brasil y México, y el 124.62% de líneas móviles por cada 100 habitantes lo ubica por debajo de Colombia y Chile; esto evita el error de asumir que la adopción digital observada en mercados más maduros se replicará con la misma intensidad en el despliegue local de canales digitales.</w:t>
       </w:r>
     </w:p>
     <w:p>

</xml_diff>